<commit_message>
feat: update proposal manuscript with new references, figures, and roadmap documentation
</commit_message>
<xml_diff>
--- a/Manuskrip/IOP-J-D/_PTM_Proposal/Draf-Proposal-PT-MANUAL.docx
+++ b/Manuskrip/IOP-J-D/_PTM_Proposal/Draf-Proposal-PT-MANUAL.docx
@@ -272,18 +272,6 @@
               </w:rPr>
             </w:pPr>
             <w:r>
-              <w:t>................................................................................................................................................................................................................................................................................................</w:t>
-            </w:r>
-            <w:r>
-              <w:t xml:space="preserve"> </w:t>
-            </w:r>
-            <w:r>
-              <w:t>dst</w:t>
-            </w:r>
-            <w:r>
-              <w:t xml:space="preserve"> </w:t>
-            </w:r>
-            <w:r>
               <w:rPr>
                 <w:lang w:val="en-ID"/>
               </w:rPr>
@@ -466,7 +454,6 @@
               </w:rPr>
             </w:pPr>
             <w:r>
-              <w:lastRenderedPageBreak/>
               <w:t>............................................................................................................................................</w:t>
             </w:r>
             <w:r>
@@ -485,7 +472,151 @@
               <w:rPr>
                 <w:lang w:val="en-ID"/>
               </w:rPr>
-              <w:t>LIBS, deep learning, CNN--Transformer, encoder--decoder, cross-attention, spectral decomposition, volcanic soil</w:t>
+              <w:t>LIBS</w:t>
+            </w:r>
+            <w:r>
+              <w:rPr>
+                <w:lang w:val="en-ID"/>
+              </w:rPr>
+              <w:t>;D</w:t>
+            </w:r>
+            <w:r>
+              <w:rPr>
+                <w:lang w:val="en-ID"/>
+              </w:rPr>
+              <w:t xml:space="preserve">eep </w:t>
+            </w:r>
+            <w:r>
+              <w:rPr>
+                <w:lang w:val="en-ID"/>
+              </w:rPr>
+              <w:t>L</w:t>
+            </w:r>
+            <w:r>
+              <w:rPr>
+                <w:lang w:val="en-ID"/>
+              </w:rPr>
+              <w:t>earning</w:t>
+            </w:r>
+            <w:r>
+              <w:rPr>
+                <w:lang w:val="en-ID"/>
+              </w:rPr>
+              <w:t>;</w:t>
+            </w:r>
+            <w:r>
+              <w:rPr>
+                <w:lang w:val="en-ID"/>
+              </w:rPr>
+              <w:t>CNN</w:t>
+            </w:r>
+            <w:r>
+              <w:rPr>
+                <w:lang w:val="en-ID"/>
+              </w:rPr>
+              <w:t>—</w:t>
+            </w:r>
+            <w:r>
+              <w:rPr>
+                <w:lang w:val="en-ID"/>
+              </w:rPr>
+              <w:t>Transformer</w:t>
+            </w:r>
+            <w:r>
+              <w:rPr>
+                <w:lang w:val="en-ID"/>
+              </w:rPr>
+              <w:t>;E</w:t>
+            </w:r>
+            <w:r>
+              <w:rPr>
+                <w:lang w:val="en-ID"/>
+              </w:rPr>
+              <w:t>ncoder</w:t>
+            </w:r>
+            <w:r>
+              <w:rPr>
+                <w:lang w:val="en-ID"/>
+              </w:rPr>
+              <w:t>—D</w:t>
+            </w:r>
+            <w:r>
+              <w:rPr>
+                <w:lang w:val="en-ID"/>
+              </w:rPr>
+              <w:t>ecoder</w:t>
+            </w:r>
+            <w:r>
+              <w:rPr>
+                <w:lang w:val="en-ID"/>
+              </w:rPr>
+              <w:t>;C</w:t>
+            </w:r>
+            <w:r>
+              <w:rPr>
+                <w:lang w:val="en-ID"/>
+              </w:rPr>
+              <w:t>ross-</w:t>
+            </w:r>
+            <w:r>
+              <w:rPr>
+                <w:lang w:val="en-ID"/>
+              </w:rPr>
+              <w:t>A</w:t>
+            </w:r>
+            <w:r>
+              <w:rPr>
+                <w:lang w:val="en-ID"/>
+              </w:rPr>
+              <w:t>ttention</w:t>
+            </w:r>
+            <w:r>
+              <w:rPr>
+                <w:lang w:val="en-ID"/>
+              </w:rPr>
+              <w:t>;S</w:t>
+            </w:r>
+            <w:r>
+              <w:rPr>
+                <w:lang w:val="en-ID"/>
+              </w:rPr>
+              <w:t xml:space="preserve">pectral </w:t>
+            </w:r>
+            <w:r>
+              <w:rPr>
+                <w:lang w:val="en-ID"/>
+              </w:rPr>
+              <w:t>D</w:t>
+            </w:r>
+            <w:r>
+              <w:rPr>
+                <w:lang w:val="en-ID"/>
+              </w:rPr>
+              <w:t>ecomposition</w:t>
+            </w:r>
+            <w:r>
+              <w:rPr>
+                <w:lang w:val="en-ID"/>
+              </w:rPr>
+              <w:t>; V</w:t>
+            </w:r>
+            <w:r>
+              <w:rPr>
+                <w:lang w:val="en-ID"/>
+              </w:rPr>
+              <w:t xml:space="preserve">olcanic </w:t>
+            </w:r>
+            <w:r>
+              <w:rPr>
+                <w:lang w:val="en-ID"/>
+              </w:rPr>
+              <w:t>S</w:t>
+            </w:r>
+            <w:r>
+              <w:rPr>
+                <w:lang w:val="en-ID"/>
+              </w:rPr>
+              <w:t>oil</w:t>
             </w:r>
           </w:p>
           <w:p>
@@ -524,6 +655,7 @@
                 <w:b/>
                 <w:color w:val="000000"/>
               </w:rPr>
+              <w:lastRenderedPageBreak/>
               <w:t>PENDAHULUAN</w:t>
             </w:r>
           </w:p>
@@ -601,11 +733,11 @@
               <w:spacing w:after="60"/>
             </w:pPr>
             <w:r>
-              <w:t>Perkembangan metode machine learning dan deep learning telah menawarkan alternatif untuk mempercepat analisis spektrum LIBS dengan mempelajari hubungan nonlinier antara spektrum dan parameter plasma secara langsung dari data. Convolutional Neural Networks (CNN) mampu menangkap fitur lokal seperti profil garis emisi, sementara arsitektur Transformer memodelkan dependensi jarak jauh sepanjang sumbu panjang gelombang (Liu et al., 2026). Model hibrida CNN–Transformer telah menunjukkan hasil menjanjikan untuk kuantifikasi unsur jejak pada baja (Liu et al., 2026) dan untuk klasifikasi signatur spektral pada sampel multi-elemen (Walidain et al., 2026). Namun, sebagian besar model data-</w:t>
+              <w:t xml:space="preserve">Perkembangan metode machine learning dan deep learning telah menawarkan alternatif untuk mempercepat analisis spektrum LIBS dengan mempelajari hubungan nonlinier antara spektrum dan parameter plasma secara langsung dari data. Convolutional Neural Networks (CNN) mampu menangkap fitur lokal seperti profil garis emisi, sementara arsitektur Transformer memodelkan dependensi jarak jauh sepanjang sumbu panjang gelombang (Liu et al., 2026). Model hibrida CNN–Transformer telah menunjukkan hasil menjanjikan untuk kuantifikasi unsur jejak pada baja (Liu et al., 2026) dan untuk klasifikasi signatur spektral pada sampel multi-elemen (Walidain et al., 2026). Namun, sebagian besar model data-driven beroperasi sebagai black box yang tidak secara eksplisit mempertimbangkan hukum fisika plasma yang mendasari pembentukan spektrum emisi (Hao et al., 2024). Fakta fisik fundamental yang belum dieksploitasi adalah: spektrum LIBS poliatomik merupakan </w:t>
             </w:r>
             <w:r>
               <w:lastRenderedPageBreak/>
-              <w:t xml:space="preserve">driven beroperasi sebagai black box yang tidak secara eksplisit mempertimbangkan hukum fisika plasma yang mendasari pembentukan spektrum emisi (Hao et al., 2024). Fakta fisik fundamental yang belum dieksploitasi adalah: spektrum LIBS poliatomik merupakan superposisi terbobot konsentrasi dari spektrum monoatomik penyusunnya. Seluruh model eksisting—baik berbasis fisika maupun data-driven—memperlakukan spektrum sebagai single signal dan mengabaikan struktur komposisional ini. </w:t>
+              <w:t xml:space="preserve">superposisi terbobot konsentrasi dari spektrum monoatomik penyusunnya. Seluruh model eksisting—baik berbasis fisika maupun data-driven—memperlakukan spektrum sebagai single signal dan mengabaikan struktur komposisional ini. </w:t>
             </w:r>
             <w:r>
               <w:rPr>
@@ -709,6 +841,14 @@
             </w:pPr>
             <w:r>
               <w:t>Tujuan Khusus</w:t>
+            </w:r>
+          </w:p>
+          <w:p>
+            <w:pPr>
+              <w:spacing w:after="60"/>
+            </w:pPr>
+            <w:r>
+              <w:t>Memodelkan komposisi spektral melalui arsitektur encoder–decoder yang secara eksplisit memodelkan hubungan antara spektrum monoatomik (representasi per-elemen) dan spektrum poliatomik (campuran terukur).</w:t>
             </w:r>
           </w:p>
           <w:p>
@@ -725,14 +865,6 @@
               <w:spacing w:after="60"/>
             </w:pPr>
             <w:r>
-              <w:t>Memodelkan komposisi spektral melalui arsitektur encoder–decoder yang secara eksplisit memodelkan hubungan antara spektrum monoatomik (representasi per-elemen) dan spektrum poliatomik (campuran terukur).</w:t>
-            </w:r>
-          </w:p>
-          <w:p>
-            <w:pPr>
-              <w:spacing w:after="60"/>
-            </w:pPr>
-            <w:r>
               <w:t>Mengembangkan arsitektur hibrida CNN–Transformer yang menggabungkan ekstraksi fitur lokal (CNN 1D untuk profil puncak emisi) dan pemodelan dependensi global (Transformer untuk korelasi antar panjang gelombang) dalam paradigma encoder–decoder.</w:t>
             </w:r>
           </w:p>
@@ -845,154 +977,197 @@
               <w:spacing w:after="60"/>
             </w:pPr>
             <w:r>
-              <w:t xml:space="preserve">Penelitian analisis geokimia material geologi dari wilayah Aceh dan Indonesia menggunakan teknik LIBS telah menjadi fokus utama grup riset. Mitaphonna et al. (2023) melakukan identifikasi deposit tsunami 2004 di Desa Pulot, Kabupaten Aceh Besar menggunakan analisis geokimia, membuktikan kemampuan teknik spektroskopi dalam mengkarakterisasi signatur geokimia tanah terdampak bencana alam. Dalam kelanjutannya, Mitaphonna et al. (2024) menerapkan teknik LIBS secara langsung untuk analisis geokimia kualitatif deposit tsunami di Seungko Mulat, Aceh Besar, berhasil mengidentifikasi keberadaan elemen-elemen mayor seperti Si, Al, Fe, Ca, Mg, Na, dan K pada sampel tanah. Studi ini menunjukkan bahwa LIBS mampu mendeteksi elemen-elemen target yang </w:t>
-            </w:r>
+              <w:t xml:space="preserve">Penelitian analisis geokimia material geologi dari wilayah Aceh dan Indonesia menggunakan teknik LIBS telah menjadi fokus utama grup riset. Mitaphonna et al. (2023) melakukan identifikasi deposit tsunami 2004 di Desa Pulot, Kabupaten Aceh Besar menggunakan analisis geokimia, membuktikan kemampuan teknik spektroskopi dalam mengkarakterisasi signatur geokimia tanah terdampak bencana alam. Dalam kelanjutannya, Mitaphonna et al. (2024) menerapkan teknik LIBS secara langsung untuk analisis geokimia kualitatif deposit tsunami di Seungko Mulat, Aceh Besar, berhasil mengidentifikasi keberadaan elemen-elemen mayor seperti Si, Al, Fe, Ca, Mg, Na, dan K pada sampel tanah. Studi ini menunjukkan bahwa LIBS mampu mendeteksi elemen-elemen target yang relevan, namun analisis yang dilakukan </w:t>
+            </w:r>
+            <w:r>
+              <w:rPr>
+                <w:b/>
+              </w:rPr>
+              <w:t>masih bersifat kualitatif</w:t>
+            </w:r>
+            <w:r>
+              <w:t xml:space="preserve"> — menjustifikasi kebutuhan pendekatan kuantitatif yang lebih akurat.</w:t>
+            </w:r>
+          </w:p>
+          <w:p>
+            <w:pPr>
+              <w:spacing w:after="60"/>
+            </w:pPr>
             <w:r>
               <w:lastRenderedPageBreak/>
-              <w:t xml:space="preserve">relevan, namun analisis yang dilakukan </w:t>
+              <w:t xml:space="preserve">Pada skala nasional, Khumaeni, Idris et al. (2025) mendemonstrasikan penerapan CF-LIBS untuk analisis komposisi geokimia dan mineral tanah vulkanik yang terdampak erupsi Gunung Merapi di Jawa Tengah. Studi ini membuktikan bahwa CF-LIBS </w:t>
             </w:r>
             <w:r>
               <w:rPr>
                 <w:b/>
               </w:rPr>
-              <w:t>masih bersifat kualitatif</w:t>
-            </w:r>
-            <w:r>
-              <w:t xml:space="preserve"> — menjustifikasi kebutuhan pendekatan kuantitatif yang lebih akurat.</w:t>
-            </w:r>
-          </w:p>
-          <w:p>
-            <w:pPr>
-              <w:spacing w:after="60"/>
-            </w:pPr>
-            <w:r>
-              <w:t xml:space="preserve">Pada skala nasional, Khumaeni, Idris et al. (2025) mendemonstrasikan penerapan CF-LIBS untuk analisis komposisi geokimia dan mineral tanah vulkanik yang terdampak erupsi Gunung Merapi di Jawa Tengah. Studi ini membuktikan bahwa CF-LIBS </w:t>
-            </w:r>
+              <w:t>dapat</w:t>
+            </w:r>
+            <w:r>
+              <w:t xml:space="preserve"> diterapkan pada tanah vulkanik Indonesia, namun sekaligus mengekspos keterbatasan inherennya: akurasi bergantung pada validitas asumsi LTE yang sering dilanggar pada matriks tanah vulkanik yang sangat heterogen. Keterbatasan ini menjadi motivasi langsung untuk pengembangan pendekatan berbasis deep learning yang diusulkan dalam tesis ini.</w:t>
+            </w:r>
+          </w:p>
+          <w:p>
+            <w:pPr>
+              <w:spacing w:after="60"/>
+            </w:pPr>
+            <w:r>
+              <w:t>B. Lanskap Riset LIBS + Artificial Intelligence</w:t>
+            </w:r>
+          </w:p>
+          <w:p>
+            <w:pPr>
+              <w:spacing w:after="60"/>
+            </w:pPr>
+            <w:r>
+              <w:t>Perkembangan penelitian LIBS telah berevolusi dari simulasi fisika murni menuju integrasi machine learning dan deep learning:</w:t>
+            </w:r>
+          </w:p>
+          <w:p>
+            <w:pPr>
+              <w:spacing w:after="60"/>
+            </w:pPr>
             <w:r>
               <w:rPr>
                 <w:b/>
               </w:rPr>
-              <w:t>dapat</w:t>
-            </w:r>
-            <w:r>
-              <w:t xml:space="preserve"> diterapkan pada tanah vulkanik Indonesia, namun sekaligus mengekspos keterbatasan inherennya: akurasi bergantung pada validitas asumsi LTE yang sering dilanggar pada matriks tanah vulkanik yang sangat heterogen. Keterbatasan ini menjadi motivasi langsung untuk pengembangan pendekatan berbasis deep learning yang diusulkan dalam tesis ini.</w:t>
-            </w:r>
-          </w:p>
-          <w:p>
-            <w:pPr>
-              <w:spacing w:after="60"/>
-            </w:pPr>
-            <w:r>
-              <w:t>B. Lanskap Riset LIBS + Artificial Intelligence</w:t>
-            </w:r>
-          </w:p>
-          <w:p>
-            <w:pPr>
-              <w:spacing w:after="60"/>
-            </w:pPr>
-            <w:r>
-              <w:t>Perkembangan penelitian LIBS telah berevolusi dari simulasi fisika murni menuju integrasi machine learning dan deep learning:</w:t>
-            </w:r>
-          </w:p>
-          <w:p>
-            <w:pPr>
-              <w:spacing w:after="60"/>
-            </w:pPr>
+              <w:t>Favre et al. (2025)</w:t>
+            </w:r>
+            <w:r>
+              <w:t xml:space="preserve"> mengembangkan pendekatan ML CF-LIBS kuantitatif yang memanfaatkan ekstraksi fitur CNN dari database simulasi berskala besar. Pendekatan ini terbukti ampuh untuk diagnostik simultan tanpa rekalibrasi, namun performa baseline-nya </w:t>
+            </w:r>
             <w:r>
               <w:rPr>
                 <w:b/>
               </w:rPr>
-              <w:t>Favre et al. (2025)</w:t>
-            </w:r>
-            <w:r>
-              <w:t xml:space="preserve"> mengembangkan pendekatan ML CF-LIBS kuantitatif yang memanfaatkan ekstraksi fitur CNN dari database simulasi berskala besar. Pendekatan ini terbukti ampuh untuk diagnostik simultan tanpa rekalibrasi, namun performa baseline-nya </w:t>
-            </w:r>
+              <w:t>kolaps pada percampuran puncak dense overlap</w:t>
+            </w:r>
+            <w:r>
+              <w:t xml:space="preserve"> yang umum dijumpai pada spektrum tanah vulkanik. Hal ini menunjukkan kebutuhan akan mekanisme kompensasi yang lebih canggih.</w:t>
+            </w:r>
+          </w:p>
+          <w:p>
+            <w:pPr>
+              <w:spacing w:after="60"/>
+            </w:pPr>
             <w:r>
               <w:rPr>
                 <w:b/>
               </w:rPr>
-              <w:t>kolaps pada percampuran puncak dense overlap</w:t>
-            </w:r>
-            <w:r>
-              <w:t xml:space="preserve"> yang umum dijumpai pada spektrum tanah vulkanik. Hal ini menunjukkan kebutuhan akan mekanisme kompensasi yang lebih canggih.</w:t>
-            </w:r>
-          </w:p>
-          <w:p>
-            <w:pPr>
-              <w:spacing w:after="60"/>
-            </w:pPr>
+              <w:t>Wang et al. (2024)</w:t>
+            </w:r>
+            <w:r>
+              <w:t xml:space="preserve"> mengusulkan hibridisasi pra-filter wavelet dengan arsitektur Transformer dan CNN untuk analisis spectral berbantuan simulasi. Pendekatan ini mantap memadukan ikatan global dependency dan deteksi pendaran lokal, namun </w:t>
+            </w:r>
             <w:r>
               <w:rPr>
                 <w:b/>
               </w:rPr>
-              <w:t>Wang et al. (2024)</w:t>
-            </w:r>
-            <w:r>
-              <w:t xml:space="preserve"> mengusulkan hibridisasi pra-filter wavelet dengan arsitektur Transformer dan CNN untuk analisis spectral berbantuan simulasi. Pendekatan ini mantap memadukan ikatan global dependency dan deteksi pendaran lokal, namun </w:t>
-            </w:r>
+              <w:t>celah overlap fisik garis emisi tetap diabaikan</w:t>
+            </w:r>
+            <w:r>
+              <w:t xml:space="preserve"> dan diperlakukan sebagai single signal statis.</w:t>
+            </w:r>
+          </w:p>
+          <w:p>
+            <w:pPr>
+              <w:spacing w:after="60"/>
+            </w:pPr>
             <w:r>
               <w:rPr>
                 <w:b/>
               </w:rPr>
-              <w:t>celah overlap fisik garis emisi tetap diabaikan</w:t>
-            </w:r>
-            <w:r>
-              <w:t xml:space="preserve"> dan diperlakukan sebagai single signal statis.</w:t>
-            </w:r>
-          </w:p>
-          <w:p>
-            <w:pPr>
-              <w:spacing w:after="60"/>
-            </w:pPr>
+              <w:t>Liu et al. (2026)</w:t>
+            </w:r>
+            <w:r>
+              <w:t xml:space="preserve"> memperkenalkan hibridisasi CNN–Transformer untuk LIBS jarak jauh (remote LIBS) pada analisis unsur baja. Arsitektur ini berhasil menggabungkan deteksi pola lokal (CNN) dan dependensi global (Transformer), namun spektrum tetap diperlakukan sebagai </w:t>
+            </w:r>
             <w:r>
               <w:rPr>
                 <w:b/>
               </w:rPr>
-              <w:t>Liu et al. (2026)</w:t>
-            </w:r>
-            <w:r>
-              <w:t xml:space="preserve"> memperkenalkan hibridisasi CNN–Transformer untuk LIBS jarak jauh (remote LIBS) pada analisis unsur baja. Arsitektur ini berhasil menggabungkan deteksi pola lokal (CNN) dan dependensi global (Transformer), namun spektrum tetap diperlakukan sebagai </w:t>
-            </w:r>
+              <w:t>single composite signal</w:t>
+            </w:r>
+            <w:r>
+              <w:t xml:space="preserve"> tanpa mempertimbangkan struktur komposisi spektral mono–poliatomik.</w:t>
+            </w:r>
+          </w:p>
+          <w:p>
+            <w:pPr>
+              <w:spacing w:after="60"/>
+            </w:pPr>
             <w:r>
               <w:rPr>
                 <w:b/>
               </w:rPr>
-              <w:t>single composite signal</w:t>
-            </w:r>
-            <w:r>
-              <w:t xml:space="preserve"> tanpa mempertimbangkan struktur komposisi spektral mono–poliatomik.</w:t>
-            </w:r>
-          </w:p>
-          <w:p>
-            <w:pPr>
-              <w:spacing w:after="60"/>
-            </w:pPr>
+              <w:t>Walidain et al. (2026)</w:t>
+            </w:r>
+            <w:r>
+              <w:t xml:space="preserve"> mengadaptasi arsitektur Informer (ProbSparse attention) untuk klasifikasi spektral LIBS pada sampel geologi. Studi ini membuktikan bahwa mekanisme attention yang efisien mampu memproses spektrum LIBS bersekuens ultra-panjang, namun </w:t>
+            </w:r>
             <w:r>
               <w:rPr>
                 <w:b/>
               </w:rPr>
-              <w:t>Walidain et al. (2026)</w:t>
-            </w:r>
-            <w:r>
-              <w:t xml:space="preserve"> mengadaptasi arsitektur Informer (ProbSparse attention) untuk klasifikasi spektral LIBS pada sampel geologi. Studi ini membuktikan bahwa mekanisme attention yang efisien mampu memproses spektrum LIBS bersekuens ultra-panjang, namun </w:t>
-            </w:r>
+              <w:t>hanya mencapai klasifikasi kualitatif</w:t>
+            </w:r>
+            <w:r>
+              <w:t>, bukan regresi kuantitatif konsentrasi.</w:t>
+            </w:r>
+          </w:p>
+          <w:p>
+            <w:pPr>
+              <w:spacing w:after="60"/>
+            </w:pPr>
+            <w:r>
+              <w:t>Kesimpulan Research Gap</w:t>
+            </w:r>
+          </w:p>
+          <w:p>
+            <w:pPr>
+              <w:spacing w:after="60"/>
+            </w:pPr>
             <w:r>
               <w:rPr>
                 <w:b/>
               </w:rPr>
-              <w:t>hanya mencapai klasifikasi kualitatif</w:t>
-            </w:r>
-            <w:r>
-              <w:t>, bukan regresi kuantitatif konsentrasi.</w:t>
-            </w:r>
-          </w:p>
-          <w:p>
-            <w:pPr>
-              <w:spacing w:after="60"/>
-            </w:pPr>
-            <w:r>
-              <w:t>Kesimpulan Research Gap</w:t>
-            </w:r>
+              <w:t>Observasi kunci</w:t>
+            </w:r>
+            <w:r>
+              <w:t>: Semua pendekatan di atas memperlakukan spektrum sebagai single signal. Struktur komposisi spektrum LIBS — yaitu bahwa spektrum poliatomik merupakan superposisi dari spektrum monoatomik penyusun — belum pernah dieksplorasi secara eksplisit. Tidak ada penelitian sebelumnya yang: (i) memisahkan spektrum monoatom vs poliatom, (ii) menggunakan mekanisme attention lintas komposisi, maupun (iii) menerapkan kerangka encoder–decoder untuk LIBS. Oleh karena itu, penelitian ini mengusulkan pendekatan di mana encoder mempelajari representasi monoatom, decoder merekonstruksi komposisi poliatom via cross-attention, dan prediksi konsentrasi unsur dilakukan secara end-to-end.</w:t>
+            </w:r>
+          </w:p>
+          <w:p>
+            <w:pPr>
+              <w:spacing w:after="60"/>
+            </w:pPr>
+            <w:r>
+              <w:t>---</w:t>
+            </w:r>
+          </w:p>
+          <w:p>
+            <w:pPr>
+              <w:spacing w:after="60"/>
+            </w:pPr>
+            <w:r>
+              <w:t>PETA JALAN (ROADMAP) PENELITIAN</w:t>
+            </w:r>
+          </w:p>
+          <w:p>
+            <w:pPr>
+              <w:spacing w:after="60"/>
+            </w:pPr>
+            <w:r>
+              <w:rPr>
+                <w:i/>
+              </w:rPr>
+              <w:t>(Sisipkan gambar diagram Peta Jalan di bawah ini)</w:t>
+            </w:r>
+          </w:p>
+          <w:p>
+            <w:pPr>
+              <w:spacing w:after="60"/>
+            </w:pPr>
           </w:p>
           <w:p>
             <w:pPr>
@@ -1002,60 +1177,10 @@
               <w:rPr>
                 <w:b/>
               </w:rPr>
-              <w:t>Observasi kunci</w:t>
-            </w:r>
-            <w:r>
-              <w:t>: Semua pendekatan di atas memperlakukan spektrum sebagai single signal. Struktur komposisi spektrum LIBS — yaitu bahwa spektrum poliatomik merupakan superposisi dari spektrum monoatomik penyusun — belum pernah dieksplorasi secara eksplisit. Tidak ada penelitian sebelumnya yang: (i) memisahkan spektrum monoatom vs poliatom, (ii) menggunakan mekanisme attention lintas komposisi, maupun (iii) menerapkan kerangka encoder–decoder untuk LIBS. Oleh karena itu, penelitian ini mengusulkan pendekatan di mana encoder mempelajari representasi monoatom, decoder merekonstruksi komposisi poliatom via cross-attention, dan prediksi konsentrasi unsur dilakukan secara end-to-end.</w:t>
-            </w:r>
-          </w:p>
-          <w:p>
-            <w:pPr>
-              <w:spacing w:after="60"/>
-            </w:pPr>
-            <w:r>
-              <w:t>---</w:t>
-            </w:r>
-          </w:p>
-          <w:p>
-            <w:pPr>
-              <w:spacing w:after="60"/>
-            </w:pPr>
-            <w:r>
-              <w:t>PETA JALAN (ROADMAP) PENELITIAN</w:t>
-            </w:r>
-          </w:p>
-          <w:p>
-            <w:pPr>
-              <w:spacing w:after="60"/>
-            </w:pPr>
-            <w:r>
-              <w:rPr>
-                <w:i/>
-              </w:rPr>
-              <w:t>(Sisipkan gambar diagram Peta Jalan di bawah ini)</w:t>
-            </w:r>
-          </w:p>
-          <w:p>
-            <w:pPr>
-              <w:spacing w:after="60"/>
-            </w:pPr>
-          </w:p>
-          <w:p>
-            <w:pPr>
-              <w:spacing w:after="60"/>
-            </w:pPr>
-            <w:r>
-              <w:rPr>
-                <w:b/>
-              </w:rPr>
               <w:t>Gambar 1.</w:t>
             </w:r>
             <w:r>
-              <w:t xml:space="preserve"> Peta jalan penelitian menunjukkan progresi dari fondasi riset grup (analisis geokimia LIBS di Aceh &amp; tanah vulkanik Indonesia) menuju riset AI spektral LIBS </w:t>
-            </w:r>
-            <w:r>
-              <w:lastRenderedPageBreak/>
-              <w:t>mutakhir, hingga kontribusi tesis ini berupa dekomposisi mono–poliatomik eksplisit via CNN–Transformer Encoder–Decoder.</w:t>
+              <w:t xml:space="preserve"> Peta jalan penelitian menunjukkan progresi dari fondasi riset grup (analisis geokimia LIBS di Aceh &amp; tanah vulkanik Indonesia) menuju riset AI spektral LIBS mutakhir, hingga kontribusi tesis ini berupa dekomposisi mono–poliatomik eksplisit via CNN–Transformer Encoder–Decoder.</w:t>
             </w:r>
           </w:p>
           <w:p>
@@ -3607,7 +3732,7 @@
       <w:rPr>
         <w:color w:val="000000"/>
       </w:rPr>
-      <w:pict w14:anchorId="07223B58">
+      <w:pict w14:anchorId="046FCB62">
         <v:shapetype id="_x0000_t75" coordsize="21600,21600" o:spt="75" o:preferrelative="t" path="m@4@5l@4@11@9@11@9@5xe" filled="f" stroked="f">
           <v:stroke joinstyle="miter"/>
           <v:formulas>
@@ -3661,7 +3786,7 @@
       <w:rPr>
         <w:color w:val="000000"/>
       </w:rPr>
-      <w:pict w14:anchorId="0554FBE7">
+      <w:pict w14:anchorId="32730E3A">
         <v:shapetype id="_x0000_t75" coordsize="21600,21600" o:spt="75" o:preferrelative="t" path="m@4@5l@4@11@9@11@9@5xe" filled="f" stroked="f">
           <v:stroke joinstyle="miter"/>
           <v:formulas>
@@ -3715,7 +3840,7 @@
       <w:rPr>
         <w:color w:val="000000"/>
       </w:rPr>
-      <w:pict w14:anchorId="445E4D23">
+      <w:pict w14:anchorId="2C196F4C">
         <v:shapetype id="_x0000_t75" coordsize="21600,21600" o:spt="75" o:preferrelative="t" path="m@4@5l@4@11@9@11@9@5xe" filled="f" stroked="f">
           <v:stroke joinstyle="miter"/>
           <v:formulas>
@@ -4879,6 +5004,7 @@
   <w:style w:type="character" w:default="1" w:styleId="DefaultParagraphFont">
     <w:name w:val="Default Paragraph Font"/>
     <w:uiPriority w:val="1"/>
+    <w:semiHidden/>
     <w:unhideWhenUsed/>
   </w:style>
   <w:style w:type="table" w:default="1" w:styleId="TableNormal">

</xml_diff>